<commit_message>
Re-map every page reference against the real 24-page PDF export
The report exports to 24 pages. Both profile forms assumed about 14, so every page
reference was wrong, most by eight to eleven pages: the objectives scorecard was
cited at p. 9 and is on p. 17, Appendix B at p. 12 and is on p. 23, the references
at pp. 10-11 and they are on pp. 21-22.

All fifteen remapped in the markdown mirror, in the hardcoded table in
fill_official_profile_form.py, and pushed into the submitted form, which now
carries page references spanning 2 to 24 and no others. The mirror records which
export they were verified against so the next re-export knows to re-check.

Verified after: 20 tests pass, ruff clean, official form has zero em-dashes and all
fifteen criteria rows filled.
</commit_message>
<xml_diff>
--- a/aamganak/Corrected Student Profile Form.docx
+++ b/aamganak/Corrected Student Profile Form.docx
@@ -832,7 +832,7 @@
               <w:rPr>
                 <w:b w:val="0"/>
               </w:rPr>
-              <w:t>§1.1–1.2, p. 2; §5.8, p. 9</w:t>
+              <w:t>§1.1–1.2, p. 2; §5.8, p. 17</w:t>
             </w:r>
           </w:p>
         </w:tc>
@@ -927,7 +927,7 @@
               <w:rPr>
                 <w:b w:val="0"/>
               </w:rPr>
-              <w:t>§1 opening, p. 1; §6.1, p. 8</w:t>
+              <w:t>§1 opening, p. 2; §6.1, pp. 17–18</w:t>
             </w:r>
           </w:p>
         </w:tc>
@@ -1021,7 +1021,7 @@
               <w:rPr>
                 <w:b w:val="0"/>
               </w:rPr>
-              <w:t>§3.1, p. 4</w:t>
+              <w:t>§3.1, pp. 6–7</w:t>
             </w:r>
           </w:p>
         </w:tc>
@@ -1115,7 +1115,7 @@
               <w:rPr>
                 <w:b w:val="0"/>
               </w:rPr>
-              <w:t>§3, pp. 4–5; Appendix B, p. 12</w:t>
+              <w:t>§3, pp. 6–9; Appendix B, p. 23</w:t>
             </w:r>
           </w:p>
         </w:tc>
@@ -1227,7 +1227,7 @@
               <w:rPr>
                 <w:b w:val="0"/>
               </w:rPr>
-              <w:t>§1.3, p. 3</w:t>
+              <w:t>§1.3, pp. 3–4</w:t>
             </w:r>
           </w:p>
         </w:tc>
@@ -1374,7 +1374,7 @@
               <w:rPr>
                 <w:b w:val="0"/>
               </w:rPr>
-              <w:t>§1.3, p. 3; Appendix B, p. 12</w:t>
+              <w:t>§1.3, pp. 3–4; Appendix B, p. 23</w:t>
             </w:r>
           </w:p>
         </w:tc>
@@ -1477,7 +1477,7 @@
               <w:rPr>
                 <w:b w:val="0"/>
               </w:rPr>
-              <w:t>§2, p. 3; References, pp. 10–11</w:t>
+              <w:t>§2, pp. 5–6; References, pp. 21–22</w:t>
             </w:r>
           </w:p>
         </w:tc>
@@ -1624,7 +1624,7 @@
               <w:rPr>
                 <w:b w:val="0"/>
               </w:rPr>
-              <w:t>§6.1, p. 8; §6.3, p. 9; §6.5, p. 9</w:t>
+              <w:t>§6.1, pp. 17–18; §6.3, p. 18; §6.5, p. 19</w:t>
             </w:r>
           </w:p>
         </w:tc>
@@ -1718,7 +1718,7 @@
               <w:rPr>
                 <w:b w:val="0"/>
               </w:rPr>
-              <w:t>§6.2, p. 9; §4, pp. 6–7; §5.6, p. 8</w:t>
+              <w:t>§6.2, p. 18; §4, pp. 9–11; §5.6, pp. 15–16</w:t>
             </w:r>
           </w:p>
         </w:tc>
@@ -1828,7 +1828,7 @@
               <w:rPr>
                 <w:b w:val="0"/>
               </w:rPr>
-              <w:t>§8, p. 10</w:t>
+              <w:t>§8, p. 20</w:t>
             </w:r>
           </w:p>
         </w:tc>
@@ -1958,7 +1958,7 @@
               <w:rPr>
                 <w:b w:val="0"/>
               </w:rPr>
-              <w:t>§3.2–3.3, pp. 4–5; Appendix C, pp. 13–14</w:t>
+              <w:t>§3.2–3.3, pp. 7–8; Appendix C, pp. 23–24</w:t>
             </w:r>
           </w:p>
         </w:tc>
@@ -2052,7 +2052,7 @@
               <w:rPr>
                 <w:b w:val="0"/>
               </w:rPr>
-              <w:t>§7, pp. 9–10</w:t>
+              <w:t>§7, pp. 19–20</w:t>
             </w:r>
           </w:p>
         </w:tc>
@@ -2156,7 +2156,7 @@
               <w:rPr>
                 <w:b w:val="0"/>
               </w:rPr>
-              <w:t>§6.4, p. 9</w:t>
+              <w:t>§6.4, pp. 18–19</w:t>
             </w:r>
           </w:p>
         </w:tc>
@@ -2266,7 +2266,7 @@
               <w:rPr>
                 <w:b w:val="0"/>
               </w:rPr>
-              <w:t>§4.1–4.3, pp. 6–7; FIX_LOG.md in the repository</w:t>
+              <w:t>§4.1–4.3, pp. 9–11; FIX_LOG.md in the repository</w:t>
             </w:r>
           </w:p>
         </w:tc>
@@ -2360,7 +2360,7 @@
               <w:rPr>
                 <w:b w:val="0"/>
               </w:rPr>
-              <w:t>Whole report; Appendix A, p. 11</w:t>
+              <w:t>Whole report; Appendix A, pp. 22–23</w:t>
             </w:r>
           </w:p>
         </w:tc>

</xml_diff>

<commit_message>
Re-map page references against the re-exported report; drop the time placeholder
The report was re-exported after the section 1.3 rewrite and the removal of the
time-spent placeholder, which moved five references: section 3.1 now sits on one
page rather than two, section 3 ends a page earlier, section 4 ends a page earlier,
sections 3.2 to 3.3 moved back a page, and sections 4.1 to 4.3 now share pages 9
to 10.

The placeholder was removed from the .docx by hand, so the markdown is brought back
into line with it. Checked first that nothing else had diverged between the two.

The submitted form now carries references spanning 2 to 24 against a 24-page report,
no em-dashes, and no trace of the replaced timeline wording.
</commit_message>
<xml_diff>
--- a/aamganak/Corrected Student Profile Form.docx
+++ b/aamganak/Corrected Student Profile Form.docx
@@ -1021,7 +1021,7 @@
               <w:rPr>
                 <w:b w:val="0"/>
               </w:rPr>
-              <w:t>§3.1, pp. 6–7</w:t>
+              <w:t>§3.1, p. 6</w:t>
             </w:r>
           </w:p>
         </w:tc>
@@ -1115,7 +1115,7 @@
               <w:rPr>
                 <w:b w:val="0"/>
               </w:rPr>
-              <w:t>§3, pp. 6–9; Appendix B, p. 23</w:t>
+              <w:t>§3, pp. 6–8; Appendix B, p. 23</w:t>
             </w:r>
           </w:p>
         </w:tc>
@@ -1718,7 +1718,7 @@
               <w:rPr>
                 <w:b w:val="0"/>
               </w:rPr>
-              <w:t>§6.2, p. 18; §4, pp. 9–11; §5.6, pp. 15–16</w:t>
+              <w:t>§6.2, p. 18; §4, pp. 9–10; §5.6, pp. 15–16</w:t>
             </w:r>
           </w:p>
         </w:tc>
@@ -1958,7 +1958,7 @@
               <w:rPr>
                 <w:b w:val="0"/>
               </w:rPr>
-              <w:t>§3.2–3.3, pp. 7–8; Appendix C, pp. 23–24</w:t>
+              <w:t>§3.2–3.3, pp. 6–7; Appendix C, pp. 23–24</w:t>
             </w:r>
           </w:p>
         </w:tc>
@@ -2266,7 +2266,7 @@
               <w:rPr>
                 <w:b w:val="0"/>
               </w:rPr>
-              <w:t>§4.1–4.3, pp. 9–11; FIX_LOG.md in the repository</w:t>
+              <w:t>§4.1–4.3, pp. 9–10; FIX_LOG.md in the repository</w:t>
             </w:r>
           </w:p>
         </w:tc>

</xml_diff>